<commit_message>
Condense draft order to one page; zero metadata
https://claude.ai/code/session_01P17mt65P6No5vkc3DV9xfU
</commit_message>
<xml_diff>
--- a/wc2024227/lodgement/WC2024227_Draft_Order.docx
+++ b/wc2024227/lodgement/WC2024227_Draft_Order.docx
@@ -389,7 +389,7 @@
     </w:p>
     <w:sectPr>
       <w:pgSz w:w="11906" w:h="16838"/>
-      <w:pgMar w:top="964" w:right="1361" w:bottom="964" w:left="1361" w:header="720" w:footer="720" w:gutter="0"/>
+      <w:pgMar w:top="794" w:right="1191" w:bottom="794" w:left="1191" w:header="720" w:footer="720" w:gutter="0"/>
       <w:cols w:space="720"/>
       <w:docGrid w:linePitch="360"/>
     </w:sectPr>
@@ -761,11 +761,11 @@
     <w:qFormat/>
     <w:rsid w:val="00FC693F"/>
     <w:pPr>
-      <w:spacing w:after="60" w:line="240" w:lineRule="auto"/>
+      <w:spacing w:after="40" w:line="240" w:lineRule="auto"/>
     </w:pPr>
     <w:rPr>
       <w:rFonts w:ascii="Times New Roman" w:hAnsi="Times New Roman"/>
-      <w:sz w:val="21"/>
+      <w:sz w:val="20"/>
     </w:rPr>
   </w:style>
   <w:style w:type="paragraph" w:styleId="Header">

</xml_diff>

<commit_message>
Tighten draft order wording: every word operative, effect unchanged
- Surplusage removed: duplicated word-and-figure numerals; (b)/(c)
  overlap in the Items 8-9 regime; doubled fatigue-risk-management
  phrasing; verbose Item 20 formula
- All operative elements verified present post-tightening; order
  numbering 1-8 unchanged (application cross-references hold); one page;
  zero metadata both formats

https://claude.ai/code/session_01P17mt65P6No5vkc3DV9xfU
</commit_message>
<xml_diff>
--- a/wc2024227/lodgement/WC2024227_Draft_Order.docx
+++ b/wc2024227/lodgement/WC2024227_Draft_Order.docx
@@ -83,7 +83,7 @@
     </w:p>
     <w:p>
       <w:pPr>
-        <w:ind w:left="510" w:hanging="510"/>
+        <w:ind w:left="454" w:hanging="454"/>
         <w:jc w:val="both"/>
       </w:pPr>
       <w:r>
@@ -97,7 +97,7 @@
     </w:p>
     <w:p>
       <w:pPr>
-        <w:ind w:left="510" w:hanging="510"/>
+        <w:ind w:left="454" w:hanging="454"/>
         <w:jc w:val="both"/>
       </w:pPr>
       <w:r>
@@ -106,12 +106,12 @@
         </w:rPr>
         <w:t>2.</w:t>
         <w:tab/>
-        <w:t>Within fourteen (14) days of this Order, MSH produce the documents described in Schedule A to the application (items 1 to 6), in native electronic format where the record is electronic.</w:t>
+        <w:t>Within 14 days of this Order, MSH produce the documents described in Schedule A to the application (items 1 to 6), in native electronic format where the record is electronic.</w:t>
       </w:r>
     </w:p>
     <w:p>
       <w:pPr>
-        <w:ind w:left="510" w:hanging="510"/>
+        <w:ind w:left="454" w:hanging="454"/>
         <w:jc w:val="both"/>
       </w:pPr>
       <w:r>
@@ -120,12 +120,12 @@
         </w:rPr>
         <w:t>3.</w:t>
         <w:tab/>
-        <w:t>Within fourteen (14) days of this Order, MSH produce the spreadsheet of recorded MET calls for the period 17–18 March 2024 identified in its response to Items 1 and 2 of the Notice.</w:t>
+        <w:t>Within 14 days of this Order, MSH produce the spreadsheet of recorded MET calls for 17–18 March 2024 identified in its response to Items 1 and 2 of the Notice.</w:t>
       </w:r>
     </w:p>
     <w:p>
       <w:pPr>
-        <w:ind w:left="510" w:hanging="510"/>
+        <w:ind w:left="454" w:hanging="454"/>
         <w:jc w:val="both"/>
       </w:pPr>
       <w:r>
@@ -134,12 +134,12 @@
         </w:rPr>
         <w:t>4.</w:t>
         <w:tab/>
-        <w:t>Documents produced in answer to Items 8 and 9 of the Notice:</w:t>
+        <w:t>Documents produced in answer to Items 8 and 9 of the Notice are to:</w:t>
       </w:r>
     </w:p>
     <w:p>
       <w:pPr>
-        <w:ind w:left="1020" w:hanging="510"/>
+        <w:ind w:left="907" w:hanging="454"/>
         <w:jc w:val="both"/>
       </w:pPr>
       <w:r>
@@ -153,7 +153,7 @@
     </w:p>
     <w:p>
       <w:pPr>
-        <w:ind w:left="1020" w:hanging="510"/>
+        <w:ind w:left="907" w:hanging="454"/>
         <w:jc w:val="both"/>
       </w:pPr>
       <w:r>
@@ -162,12 +162,12 @@
         </w:rPr>
         <w:t>(b)</w:t>
         <w:tab/>
-        <w:t>be inspected only by the parties and their representatives, and only for the purposes of this proceeding;</w:t>
+        <w:t>be inspected only by the parties and their representatives;</w:t>
       </w:r>
     </w:p>
     <w:p>
       <w:pPr>
-        <w:ind w:left="1020" w:hanging="510"/>
+        <w:ind w:left="907" w:hanging="454"/>
         <w:jc w:val="both"/>
       </w:pPr>
       <w:r>
@@ -176,12 +176,12 @@
         </w:rPr>
         <w:t>(c)</w:t>
         <w:tab/>
-        <w:t>be used only for the purposes of this proceeding; and</w:t>
+        <w:t>be used only for this proceeding; and</w:t>
       </w:r>
     </w:p>
     <w:p>
       <w:pPr>
-        <w:ind w:left="1020" w:hanging="510"/>
+        <w:ind w:left="907" w:hanging="454"/>
         <w:jc w:val="both"/>
       </w:pPr>
       <w:r>
@@ -190,12 +190,12 @@
         </w:rPr>
         <w:t>(d)</w:t>
         <w:tab/>
-        <w:t>be confined to credential, date and time-stamp fields, with any non-responsive personal information redacted.</w:t>
+        <w:t>be confined to credential, date and time-stamp fields, with non-responsive personal information redacted.</w:t>
       </w:r>
     </w:p>
     <w:p>
       <w:pPr>
-        <w:ind w:left="510" w:hanging="510"/>
+        <w:ind w:left="454" w:hanging="454"/>
         <w:jc w:val="both"/>
       </w:pPr>
       <w:r>
@@ -204,12 +204,12 @@
         </w:rPr>
         <w:t>5.</w:t>
         <w:tab/>
-        <w:t>Order 1, so far as it concerns Item 19, takes effect seven (7) days after the Appellant gives written notice of this Order to Together Queensland. Together Queensland has liberty to apply within that period.</w:t>
+        <w:t>Order 1 takes effect, as to Item 19, 7 days after the Appellant gives Together Queensland written notice of this Order. Together Queensland has liberty to apply within that period.</w:t>
       </w:r>
     </w:p>
     <w:p>
       <w:pPr>
-        <w:ind w:left="510" w:hanging="510"/>
+        <w:ind w:left="454" w:hanging="454"/>
         <w:jc w:val="both"/>
       </w:pPr>
       <w:r>
@@ -218,12 +218,12 @@
         </w:rPr>
         <w:t>6.</w:t>
         <w:tab/>
-        <w:t>Pursuant to rule 64G(2), within fourteen (14) days of this Order, MSH file and serve an affidavit, or affidavits, of an officer or officers with direct knowledge of the searches undertaken and of the relevant governance arrangements, which:</w:t>
+        <w:t>Pursuant to rule 64G(2), within 14 days of this Order, MSH file and serve an affidavit or affidavits of an officer or officers with direct knowledge of the searches and the relevant governance arrangements, which:</w:t>
       </w:r>
     </w:p>
     <w:p>
       <w:pPr>
-        <w:ind w:left="1020" w:hanging="510"/>
+        <w:ind w:left="907" w:hanging="454"/>
         <w:jc w:val="both"/>
       </w:pPr>
       <w:r>
@@ -232,12 +232,12 @@
         </w:rPr>
         <w:t>(a)</w:t>
         <w:tab/>
-        <w:t>verifies MSH’s statements that documents responsive to Items 1–2 (non-retention following the SPOK upgrade), 3(c), 4, 5, 7, 14 and 20 of the Notice do not exist or are not in its possession or control, identifying in each case the systems searched, the searches undertaken, and the basis for the statement;</w:t>
+        <w:t>verifies MSH’s statements that documents responsive to Items 1–2 (non-retention following the SPOK upgrade), 3(c), 4, 5, 7, 14 and 20 of the Notice do not exist or are not in its possession or control, identifying in each case the systems searched, the searches undertaken and the basis for the statement;</w:t>
       </w:r>
     </w:p>
     <w:p>
       <w:pPr>
-        <w:ind w:left="1020" w:hanging="510"/>
+        <w:ind w:left="907" w:hanging="454"/>
         <w:jc w:val="both"/>
       </w:pPr>
       <w:r>
@@ -246,12 +246,12 @@
         </w:rPr>
         <w:t>(b)</w:t>
         <w:tab/>
-        <w:t>identifies, as to Items 4, 5 and 7, the governance registers, policy repositories and training records searched, the result of those searches, and whether those searches identified any fatigue risk management training requirement, fatigue risk management assessment process, or other fatigue-management requirement applying to Logan Hospital Switchboard staff before 30 June 2024;</w:t>
+        <w:t>identifies, as to Items 4, 5 and 7, the governance registers, policy repositories and training records searched, the results, and whether the searches identified any fatigue-management training requirement, assessment process or other requirement applying to Logan Hospital Switchboard staff before 30 June 2024;</w:t>
       </w:r>
     </w:p>
     <w:p>
       <w:pPr>
-        <w:ind w:left="1020" w:hanging="510"/>
+        <w:ind w:left="907" w:hanging="454"/>
         <w:jc w:val="both"/>
       </w:pPr>
       <w:r>
@@ -260,12 +260,12 @@
         </w:rPr>
         <w:t>(c)</w:t>
         <w:tab/>
-        <w:t>states, as to Item 20, should non-possession or non-existence be maintained, the precise basis on which that position is maintained having regard to the correspondence at Annexure C of the application;</w:t>
+        <w:t>states, as to Item 20, if non-existence or non-possession is maintained, the precise basis for that position, having regard to Annexure C of the application;</w:t>
       </w:r>
     </w:p>
     <w:p>
       <w:pPr>
-        <w:ind w:left="1020" w:hanging="510"/>
+        <w:ind w:left="907" w:hanging="454"/>
         <w:jc w:val="both"/>
       </w:pPr>
       <w:r>
@@ -274,12 +274,12 @@
         </w:rPr>
         <w:t>(d)</w:t>
         <w:tab/>
-        <w:t>states, as to Item 14, the date on which a Queensland Health mobile device was issued to the Line Manager and whether any responsive communications exist on MSH systems;</w:t>
+        <w:t>states, as to Item 14, the date a Queensland Health mobile device was issued to the Line Manager and whether responsive communications exist on MSH systems;</w:t>
       </w:r>
     </w:p>
     <w:p>
       <w:pPr>
-        <w:ind w:left="1020" w:hanging="510"/>
+        <w:ind w:left="907" w:hanging="454"/>
         <w:jc w:val="both"/>
       </w:pPr>
       <w:r>
@@ -293,7 +293,7 @@
     </w:p>
     <w:p>
       <w:pPr>
-        <w:ind w:left="1020" w:hanging="510"/>
+        <w:ind w:left="907" w:hanging="454"/>
         <w:jc w:val="both"/>
       </w:pPr>
       <w:r>
@@ -302,12 +302,12 @@
         </w:rPr>
         <w:t>(f)</w:t>
         <w:tab/>
-        <w:t>confirms, as to Item 18, MSH’s statement that the destruction of the record is conceded on the pleadings, production under that Item not otherwise being pressed.</w:t>
+        <w:t>confirms, as to Item 18, that the destruction of the record is conceded on the pleadings; production under that Item is not otherwise pressed.</w:t>
       </w:r>
     </w:p>
     <w:p>
       <w:pPr>
-        <w:ind w:left="510" w:hanging="510"/>
+        <w:ind w:left="454" w:hanging="454"/>
         <w:jc w:val="both"/>
       </w:pPr>
       <w:r>
@@ -316,12 +316,12 @@
         </w:rPr>
         <w:t>7.</w:t>
         <w:tab/>
-        <w:t>Each party bear its own costs of the application, in accordance with rule 64G(3).</w:t>
+        <w:t>Each party bear its own costs of the application (rule 64G(3)).</w:t>
       </w:r>
     </w:p>
     <w:p>
       <w:pPr>
-        <w:ind w:left="510" w:hanging="510"/>
+        <w:ind w:left="454" w:hanging="454"/>
         <w:jc w:val="both"/>
       </w:pPr>
       <w:r>
@@ -330,7 +330,7 @@
         </w:rPr>
         <w:t>8.</w:t>
         <w:tab/>
-        <w:t>The parties and MSH have liberty to apply, on three (3) days’ written notice, as to the mechanics of production under this Order.</w:t>
+        <w:t>The parties and MSH have liberty to apply, on 3 days’ written notice, as to the mechanics of production under this Order.</w:t>
       </w:r>
     </w:p>
     <w:p>
@@ -389,7 +389,7 @@
     </w:p>
     <w:sectPr>
       <w:pgSz w:w="11906" w:h="16838"/>
-      <w:pgMar w:top="794" w:right="1191" w:bottom="794" w:left="1191" w:header="720" w:footer="720" w:gutter="0"/>
+      <w:pgMar w:top="907" w:right="1247" w:bottom="907" w:left="1247" w:header="720" w:footer="720" w:gutter="0"/>
       <w:cols w:space="720"/>
       <w:docGrid w:linePitch="360"/>
     </w:sectPr>
@@ -761,11 +761,11 @@
     <w:qFormat/>
     <w:rsid w:val="00FC693F"/>
     <w:pPr>
-      <w:spacing w:after="40" w:line="240" w:lineRule="auto"/>
+      <w:spacing w:after="60" w:line="245" w:lineRule="auto"/>
     </w:pPr>
     <w:rPr>
       <w:rFonts w:ascii="Times New Roman" w:hAnsi="Times New Roman"/>
-      <w:sz w:val="20"/>
+      <w:sz w:val="21"/>
     </w:rPr>
   </w:style>
   <w:style w:type="paragraph" w:styleId="Header">

</xml_diff>